<commit_message>
paper oficial final V4
</commit_message>
<xml_diff>
--- a/Exploring the Interplay of Lifestyle, Academic, and Psychological Factors on Mental Health Outcomes in University Students.docx
+++ b/Exploring the Interplay of Lifestyle, Academic, and Psychological Factors on Mental Health Outcomes in University Students.docx
@@ -6,7 +6,13 @@
       <w:pPr>
         <w:pStyle w:val="Normal"/>
         <w:jc w:val="start"/>
-        <w:rPr/>
+        <w:rPr>
+          <w:rFonts w:ascii="Liberation Serif" w:hAnsi="Liberation Serif"/>
+          <w:b/>
+          <w:bCs/>
+          <w:sz w:val="26"/>
+          <w:szCs w:val="26"/>
+        </w:rPr>
       </w:pPr>
       <w:r>
         <w:rPr>
@@ -2124,6 +2130,28 @@
           <w:sz w:val="20"/>
           <w:szCs w:val="20"/>
         </w:rPr>
+      </w:r>
+    </w:p>
+    <w:p>
+      <w:pPr>
+        <w:pStyle w:val="Normal"/>
+        <w:jc w:val="both"/>
+        <w:rPr>
+          <w:rFonts w:ascii="Liberation Serif" w:hAnsi="Liberation Serif"/>
+          <w:b w:val="false"/>
+          <w:bCs w:val="false"/>
+          <w:sz w:val="20"/>
+          <w:szCs w:val="20"/>
+        </w:rPr>
+      </w:pPr>
+      <w:r>
+        <w:rPr>
+          <w:rFonts w:ascii="Liberation Serif" w:hAnsi="Liberation Serif"/>
+          <w:b w:val="false"/>
+          <w:bCs w:val="false"/>
+          <w:sz w:val="20"/>
+          <w:szCs w:val="20"/>
+        </w:rPr>
         <w:t>This bar chart displays the number of students from different educational backgrounds. Each bar represents a specific course or level of education, and the height of the bar indicates how many students belong to that category.</w:t>
       </w:r>
     </w:p>
@@ -2583,6 +2611,317 @@
           <w:sz w:val="26"/>
           <w:szCs w:val="26"/>
         </w:rPr>
+        <w:t>Recommendations</w:t>
+      </w:r>
+    </w:p>
+    <w:p>
+      <w:pPr>
+        <w:pStyle w:val="Normal"/>
+        <w:jc w:val="both"/>
+        <w:rPr>
+          <w:rFonts w:ascii="Liberation Serif" w:hAnsi="Liberation Serif"/>
+          <w:b w:val="false"/>
+          <w:bCs w:val="false"/>
+          <w:sz w:val="20"/>
+          <w:szCs w:val="20"/>
+        </w:rPr>
+      </w:pPr>
+      <w:r>
+        <w:rPr>
+          <w:rFonts w:ascii="Liberation Serif" w:hAnsi="Liberation Serif"/>
+          <w:b w:val="false"/>
+          <w:bCs w:val="false"/>
+          <w:sz w:val="20"/>
+          <w:szCs w:val="20"/>
+        </w:rPr>
+        <w:t>Based on the analysis of factors affecting students mental health and academic performance, the following recommendations are proposed to educational institutions, mental health practitioners, and policy developers:</w:t>
+      </w:r>
+    </w:p>
+    <w:p>
+      <w:pPr>
+        <w:pStyle w:val="Normal"/>
+        <w:jc w:val="both"/>
+        <w:rPr>
+          <w:rFonts w:ascii="Liberation Serif" w:hAnsi="Liberation Serif"/>
+          <w:b w:val="false"/>
+          <w:bCs w:val="false"/>
+          <w:sz w:val="20"/>
+          <w:szCs w:val="20"/>
+        </w:rPr>
+      </w:pPr>
+      <w:r>
+        <w:rPr>
+          <w:rFonts w:ascii="Liberation Serif" w:hAnsi="Liberation Serif"/>
+          <w:b w:val="false"/>
+          <w:bCs w:val="false"/>
+          <w:sz w:val="20"/>
+          <w:szCs w:val="20"/>
+        </w:rPr>
+        <w:t xml:space="preserve">1. </w:t>
+      </w:r>
+      <w:r>
+        <w:rPr>
+          <w:rFonts w:ascii="Liberation Serif" w:hAnsi="Liberation Serif"/>
+          <w:b w:val="false"/>
+          <w:bCs w:val="false"/>
+          <w:sz w:val="20"/>
+          <w:szCs w:val="20"/>
+        </w:rPr>
+        <w:t>Implement Comprehensive Mental Health Support Programs.</w:t>
+      </w:r>
+    </w:p>
+    <w:p>
+      <w:pPr>
+        <w:pStyle w:val="Normal"/>
+        <w:jc w:val="both"/>
+        <w:rPr>
+          <w:rFonts w:ascii="Liberation Serif" w:hAnsi="Liberation Serif"/>
+          <w:b w:val="false"/>
+          <w:bCs w:val="false"/>
+          <w:sz w:val="20"/>
+          <w:szCs w:val="20"/>
+        </w:rPr>
+      </w:pPr>
+      <w:r>
+        <w:rPr>
+          <w:rFonts w:ascii="Liberation Serif" w:hAnsi="Liberation Serif"/>
+          <w:b w:val="false"/>
+          <w:bCs w:val="false"/>
+          <w:sz w:val="20"/>
+          <w:szCs w:val="20"/>
+        </w:rPr>
+        <w:t xml:space="preserve">2. </w:t>
+      </w:r>
+      <w:r>
+        <w:rPr>
+          <w:rFonts w:ascii="Liberation Serif" w:hAnsi="Liberation Serif"/>
+          <w:b w:val="false"/>
+          <w:bCs w:val="false"/>
+          <w:sz w:val="20"/>
+          <w:szCs w:val="20"/>
+        </w:rPr>
+        <w:t>Institutions should offer accessible and confidential counseling services that address suicidal thoughts, stress, and anxiety. Regular mental health screenings and early intervention programs should be integrated into campus health services.</w:t>
+      </w:r>
+    </w:p>
+    <w:p>
+      <w:pPr>
+        <w:pStyle w:val="Normal"/>
+        <w:jc w:val="both"/>
+        <w:rPr>
+          <w:rFonts w:ascii="Liberation Serif" w:hAnsi="Liberation Serif"/>
+          <w:b w:val="false"/>
+          <w:bCs w:val="false"/>
+          <w:sz w:val="20"/>
+          <w:szCs w:val="20"/>
+        </w:rPr>
+      </w:pPr>
+      <w:r>
+        <w:rPr>
+          <w:rFonts w:ascii="Liberation Serif" w:hAnsi="Liberation Serif"/>
+          <w:b w:val="false"/>
+          <w:bCs w:val="false"/>
+          <w:sz w:val="20"/>
+          <w:szCs w:val="20"/>
+        </w:rPr>
+      </w:r>
+    </w:p>
+    <w:p>
+      <w:pPr>
+        <w:pStyle w:val="Normal"/>
+        <w:jc w:val="both"/>
+        <w:rPr>
+          <w:rFonts w:ascii="Liberation Serif" w:hAnsi="Liberation Serif"/>
+          <w:b w:val="false"/>
+          <w:bCs w:val="false"/>
+          <w:sz w:val="20"/>
+          <w:szCs w:val="20"/>
+        </w:rPr>
+      </w:pPr>
+      <w:r>
+        <w:rPr>
+          <w:rFonts w:ascii="Liberation Serif" w:hAnsi="Liberation Serif"/>
+          <w:b w:val="false"/>
+          <w:bCs w:val="false"/>
+          <w:sz w:val="20"/>
+          <w:szCs w:val="20"/>
+        </w:rPr>
+        <w:t>Introduce Stress Management Workshops</w:t>
+      </w:r>
+    </w:p>
+    <w:p>
+      <w:pPr>
+        <w:pStyle w:val="Normal"/>
+        <w:jc w:val="both"/>
+        <w:rPr>
+          <w:rFonts w:ascii="Liberation Serif" w:hAnsi="Liberation Serif"/>
+          <w:b w:val="false"/>
+          <w:bCs w:val="false"/>
+          <w:sz w:val="20"/>
+          <w:szCs w:val="20"/>
+        </w:rPr>
+      </w:pPr>
+      <w:r>
+        <w:rPr>
+          <w:rFonts w:ascii="Liberation Serif" w:hAnsi="Liberation Serif"/>
+          <w:b w:val="false"/>
+          <w:bCs w:val="false"/>
+          <w:sz w:val="20"/>
+          <w:szCs w:val="20"/>
+        </w:rPr>
+        <w:t xml:space="preserve">3. </w:t>
+      </w:r>
+      <w:r>
+        <w:rPr>
+          <w:rFonts w:ascii="Liberation Serif" w:hAnsi="Liberation Serif"/>
+          <w:b w:val="false"/>
+          <w:bCs w:val="false"/>
+          <w:sz w:val="20"/>
+          <w:szCs w:val="20"/>
+        </w:rPr>
+        <w:t>Conduct regular sessions on managing academic and financial stress, time management, and coping strategies. These can help students better handle pressure related to CGPA, study satisfaction, and work obligations.</w:t>
+      </w:r>
+    </w:p>
+    <w:p>
+      <w:pPr>
+        <w:pStyle w:val="Normal"/>
+        <w:jc w:val="both"/>
+        <w:rPr>
+          <w:rFonts w:ascii="Liberation Serif" w:hAnsi="Liberation Serif"/>
+          <w:b w:val="false"/>
+          <w:bCs w:val="false"/>
+          <w:sz w:val="20"/>
+          <w:szCs w:val="20"/>
+        </w:rPr>
+      </w:pPr>
+      <w:r>
+        <w:rPr>
+          <w:rFonts w:ascii="Liberation Serif" w:hAnsi="Liberation Serif"/>
+          <w:b w:val="false"/>
+          <w:bCs w:val="false"/>
+          <w:sz w:val="20"/>
+          <w:szCs w:val="20"/>
+        </w:rPr>
+        <w:t xml:space="preserve">4. </w:t>
+      </w:r>
+      <w:r>
+        <w:rPr>
+          <w:rFonts w:ascii="Liberation Serif" w:hAnsi="Liberation Serif"/>
+          <w:b w:val="false"/>
+          <w:bCs w:val="false"/>
+          <w:sz w:val="20"/>
+          <w:szCs w:val="20"/>
+        </w:rPr>
+        <w:t>Promote Healthy Lifestyle Habits Encourage students to maintain balanced dietary habits and adequate sleep through awareness campaigns, wellness programs, and providing healthy food options in cafeterias. Sleep hygiene education should also be part of student orientation programs.</w:t>
+      </w:r>
+    </w:p>
+    <w:p>
+      <w:pPr>
+        <w:pStyle w:val="Normal"/>
+        <w:jc w:val="both"/>
+        <w:rPr>
+          <w:rFonts w:ascii="Liberation Serif" w:hAnsi="Liberation Serif"/>
+          <w:b w:val="false"/>
+          <w:bCs w:val="false"/>
+          <w:sz w:val="20"/>
+          <w:szCs w:val="20"/>
+        </w:rPr>
+      </w:pPr>
+      <w:r>
+        <w:rPr>
+          <w:rFonts w:ascii="Liberation Serif" w:hAnsi="Liberation Serif"/>
+          <w:b w:val="false"/>
+          <w:bCs w:val="false"/>
+          <w:sz w:val="20"/>
+          <w:szCs w:val="20"/>
+        </w:rPr>
+        <w:t xml:space="preserve">5. </w:t>
+      </w:r>
+      <w:r>
+        <w:rPr>
+          <w:rFonts w:ascii="Liberation Serif" w:hAnsi="Liberation Serif"/>
+          <w:b w:val="false"/>
+          <w:bCs w:val="false"/>
+          <w:sz w:val="20"/>
+          <w:szCs w:val="20"/>
+        </w:rPr>
+        <w:t>Enhance Academic Flexibility and Support. Reduce unnecessary academic pressure by offering flexible deadlines, academic counseling, and mentorship programs. Creating a supportive academic environment can significantly improve study satisfaction and performance.</w:t>
+      </w:r>
+    </w:p>
+    <w:p>
+      <w:pPr>
+        <w:pStyle w:val="Normal"/>
+        <w:jc w:val="both"/>
+        <w:rPr>
+          <w:rFonts w:ascii="Liberation Serif" w:hAnsi="Liberation Serif"/>
+          <w:b w:val="false"/>
+          <w:bCs w:val="false"/>
+          <w:sz w:val="20"/>
+          <w:szCs w:val="20"/>
+        </w:rPr>
+      </w:pPr>
+      <w:r>
+        <w:rPr>
+          <w:rFonts w:ascii="Liberation Serif" w:hAnsi="Liberation Serif"/>
+          <w:b w:val="false"/>
+          <w:bCs w:val="false"/>
+          <w:sz w:val="20"/>
+          <w:szCs w:val="20"/>
+        </w:rPr>
+        <w:t xml:space="preserve">6. </w:t>
+      </w:r>
+      <w:r>
+        <w:rPr>
+          <w:rFonts w:ascii="Liberation Serif" w:hAnsi="Liberation Serif"/>
+          <w:b w:val="false"/>
+          <w:bCs w:val="false"/>
+          <w:sz w:val="20"/>
+          <w:szCs w:val="20"/>
+        </w:rPr>
+        <w:t>Provide Financial Assistance and Career Guidance Offer scholarships, part-time job placements, and financial counseling services to reduce the burden of financial stress and work pressure among students.</w:t>
+      </w:r>
+    </w:p>
+    <w:p>
+      <w:pPr>
+        <w:pStyle w:val="Normal"/>
+        <w:jc w:val="both"/>
+        <w:rPr>
+          <w:rFonts w:ascii="Liberation Serif" w:hAnsi="Liberation Serif"/>
+          <w:b w:val="false"/>
+          <w:bCs w:val="false"/>
+          <w:sz w:val="20"/>
+          <w:szCs w:val="20"/>
+        </w:rPr>
+      </w:pPr>
+      <w:r>
+        <w:rPr>
+          <w:rFonts w:ascii="Liberation Serif" w:hAnsi="Liberation Serif"/>
+          <w:b w:val="false"/>
+          <w:bCs w:val="false"/>
+          <w:sz w:val="20"/>
+          <w:szCs w:val="20"/>
+        </w:rPr>
+      </w:r>
+    </w:p>
+    <w:p>
+      <w:pPr>
+        <w:pStyle w:val="Normal"/>
+        <w:jc w:val="both"/>
+        <w:rPr>
+          <w:rFonts w:ascii="Liberation Serif" w:hAnsi="Liberation Serif"/>
+          <w:b/>
+          <w:bCs/>
+          <w:sz w:val="26"/>
+          <w:szCs w:val="26"/>
+        </w:rPr>
+      </w:pPr>
+      <w:r>
+        <w:rPr>
+          <w:rFonts w:ascii="Liberation Serif" w:hAnsi="Liberation Serif"/>
+          <w:b/>
+          <w:bCs/>
+          <w:sz w:val="26"/>
+          <w:szCs w:val="26"/>
+        </w:rPr>
         <w:t>CONCLUSION</w:t>
       </w:r>
     </w:p>
@@ -2602,7 +2941,45 @@
           <w:sz w:val="20"/>
           <w:szCs w:val="20"/>
         </w:rPr>
-        <w:t>This study explored the impact of academic, lifestyle, and psychological factors on suicidal thoughts among students using logistic regression. By analyzing variables such as academic pressure, financial stress, sleep duration, and family history of mental illness, we identified key contributors to mental health risks.</w:t>
+        <w:t>This case study highlights the significant influence of academic, lifestyle, and psychological variables on students' mental health and academic performance. The analysis demonstrates that high academic and financial pressures, inadequate sleep, poor dietary habits, and a family history of mental illness are strongly associated with increased stress levels and suicidal thoughts. Conversely, factors such as study satisfaction, balanced lifestyles, and effective coping mechanisms contribute positively to both mental well-being and academic success.</w:t>
+      </w:r>
+    </w:p>
+    <w:p>
+      <w:pPr>
+        <w:pStyle w:val="Normal"/>
+        <w:jc w:val="both"/>
+        <w:rPr>
+          <w:rFonts w:ascii="Liberation Serif" w:hAnsi="Liberation Serif"/>
+          <w:sz w:val="20"/>
+          <w:szCs w:val="20"/>
+        </w:rPr>
+      </w:pPr>
+      <w:r>
+        <w:rPr>
+          <w:rFonts w:ascii="Liberation Serif" w:hAnsi="Liberation Serif"/>
+          <w:sz w:val="20"/>
+          <w:szCs w:val="20"/>
+        </w:rPr>
+        <w:t>Recognizing these interconnected factors is crucial for educational institutions aiming to foster a healthier and more supportive learning environment. By implementing targeted interventions and promoting holistic well-being, institutions can play a pivotal role in reducing mental health risks and enhancing the overall academic experience for students.</w:t>
+      </w:r>
+    </w:p>
+    <w:p>
+      <w:pPr>
+        <w:pStyle w:val="Normal"/>
+        <w:jc w:val="both"/>
+        <w:rPr>
+          <w:rFonts w:ascii="Liberation Serif" w:hAnsi="Liberation Serif"/>
+          <w:sz w:val="20"/>
+          <w:szCs w:val="20"/>
+        </w:rPr>
+      </w:pPr>
+      <w:r>
+        <w:rPr>
+          <w:rFonts w:ascii="Liberation Serif" w:hAnsi="Liberation Serif"/>
+          <w:sz w:val="20"/>
+          <w:szCs w:val="20"/>
+        </w:rPr>
+        <w:t>Ultimately, addressing student mental health is not only a moral imperative but also a strategic investment in their future success and society’s long-term well-being.</w:t>
       </w:r>
     </w:p>
     <w:p>
@@ -2621,7 +2998,6 @@
           <w:sz w:val="20"/>
           <w:szCs w:val="20"/>
         </w:rPr>
-        <w:t>The model revealed that academic and financial pressures, along with family mental health history, were significant predictors of suicidal ideation. Conversely, healthy sleep patterns and study satisfaction showed protective effects.</w:t>
       </w:r>
     </w:p>
     <w:p>
@@ -2630,45 +3006,10 @@
         <w:jc w:val="start"/>
         <w:rPr>
           <w:rFonts w:ascii="Liberation Serif" w:hAnsi="Liberation Serif"/>
-          <w:sz w:val="20"/>
-          <w:szCs w:val="20"/>
-        </w:rPr>
-      </w:pPr>
-      <w:r>
-        <w:rPr>
-          <w:rFonts w:ascii="Liberation Serif" w:hAnsi="Liberation Serif"/>
-          <w:sz w:val="20"/>
-          <w:szCs w:val="20"/>
-        </w:rPr>
-        <w:t>These findings highlight the urgent need for mental health support systems within academic institutions. Targeted interventions can be designed based on these predictors to help students cope with stress and improve their well-being.</w:t>
-      </w:r>
-    </w:p>
-    <w:p>
-      <w:pPr>
-        <w:pStyle w:val="Normal"/>
-        <w:jc w:val="start"/>
-        <w:rPr>
-          <w:rFonts w:ascii="Liberation Serif" w:hAnsi="Liberation Serif"/>
-          <w:sz w:val="20"/>
-          <w:szCs w:val="20"/>
-        </w:rPr>
-      </w:pPr>
-      <w:r>
-        <w:rPr>
-          <w:rFonts w:ascii="Liberation Serif" w:hAnsi="Liberation Serif"/>
-          <w:sz w:val="20"/>
-          <w:szCs w:val="20"/>
-        </w:rPr>
-      </w:r>
-    </w:p>
-    <w:p>
-      <w:pPr>
-        <w:pStyle w:val="Normal"/>
-        <w:jc w:val="start"/>
-        <w:rPr>
-          <w:rFonts w:ascii="Liberation Serif" w:hAnsi="Liberation Serif"/>
-          <w:sz w:val="20"/>
-          <w:szCs w:val="20"/>
+          <w:b/>
+          <w:bCs/>
+          <w:sz w:val="26"/>
+          <w:szCs w:val="26"/>
         </w:rPr>
       </w:pPr>
       <w:r>
@@ -2804,6 +3145,28 @@
           <w:szCs w:val="18"/>
         </w:rPr>
         <w:br/>
+      </w:r>
+    </w:p>
+    <w:p>
+      <w:pPr>
+        <w:pStyle w:val="Normal"/>
+        <w:jc w:val="start"/>
+        <w:rPr>
+          <w:rFonts w:ascii="Liberation Serif" w:hAnsi="Liberation Serif"/>
+          <w:b w:val="false"/>
+          <w:bCs w:val="false"/>
+          <w:sz w:val="18"/>
+          <w:szCs w:val="18"/>
+        </w:rPr>
+      </w:pPr>
+      <w:r>
+        <w:rPr>
+          <w:rFonts w:ascii="Liberation Serif" w:hAnsi="Liberation Serif"/>
+          <w:b w:val="false"/>
+          <w:bCs w:val="false"/>
+          <w:sz w:val="18"/>
+          <w:szCs w:val="18"/>
+        </w:rPr>
       </w:r>
     </w:p>
     <w:p>
@@ -3269,6 +3632,11 @@
       <w:u w:val="single"/>
     </w:rPr>
   </w:style>
+  <w:style w:type="character" w:styleId="NumberingSymbols">
+    <w:name w:val="Numbering Symbols"/>
+    <w:qFormat/>
+    <w:rPr/>
+  </w:style>
   <w:style w:type="paragraph" w:styleId="Heading">
     <w:name w:val="Heading"/>
     <w:basedOn w:val="Normal"/>

</xml_diff>